<commit_message>
PRD v0.3: make it ready to submit
On the owner's instruction of 10 October 2026, the footer no longer reads
"Draft for review". It now reads "MSE-PRD-001 v0.3 | Page n". The bullets of
Section 6.3 open with a bold lead phrase, as Section 2's bullets do. The text
is unchanged. The PDF is rebuilt from the Word file.

Co-Authored-By: Claude Opus 5.5 <noreply@anthropic.com>
Claude-Session: https://claude.ai/code/session_012aMiKMfksUffecLwDKmvEP
</commit_message>
<xml_diff>
--- a/project-source/MyShopEdge_MVP_PRD_v0.3.docx
+++ b/project-source/MyShopEdge_MVP_PRD_v0.3.docx
@@ -4674,10 +4674,20 @@
       <w:r>
         <w:rPr>
           <w:rFonts w:ascii="Calibri" w:cs="Calibri" w:eastAsia="Calibri" w:hAnsi="Calibri"/>
+          <w:b/>
           <w:sz w:val="21"/>
           <w:szCs w:val="21"/>
         </w:rPr>
-        <w:t>Authorisation. A seller connects a shop through TikTok’s authorisation page. MyShopEdge stores the access and refresh tokens encrypted, and it refreshes the access token before it expires.</w:t>
+        <w:t>Authorisation.</w:t>
+      </w:r>
+      <w:r>
+        <w:rPr>
+          <w:rFonts w:ascii="Calibri" w:cs="Calibri" w:eastAsia="Calibri" w:hAnsi="Calibri"/>
+          <w:b w:val="0"/>
+          <w:sz w:val="21"/>
+          <w:szCs w:val="21"/>
+        </w:rPr>
+        <w:t xml:space="preserve"> A seller connects a shop through TikTok’s authorisation page. MyShopEdge stores the access and refresh tokens encrypted, and it refreshes the access token before it expires.</w:t>
       </w:r>
     </w:p>
     <w:p>
@@ -4692,10 +4702,20 @@
       <w:r>
         <w:rPr>
           <w:rFonts w:ascii="Calibri" w:cs="Calibri" w:eastAsia="Calibri" w:hAnsi="Calibri"/>
+          <w:b/>
           <w:sz w:val="21"/>
           <w:szCs w:val="21"/>
         </w:rPr>
-        <w:t>Data read. MyShopEdge reads orders, returns, finance statements and their transactions, unsettled orders and inventory levels through the Authorization, Order, Return and Refund, Finance and Product APIs. It makes no call that changes the seller’s shop.</w:t>
+        <w:t>Data read.</w:t>
+      </w:r>
+      <w:r>
+        <w:rPr>
+          <w:rFonts w:ascii="Calibri" w:cs="Calibri" w:eastAsia="Calibri" w:hAnsi="Calibri"/>
+          <w:b w:val="0"/>
+          <w:sz w:val="21"/>
+          <w:szCs w:val="21"/>
+        </w:rPr>
+        <w:t xml:space="preserve"> MyShopEdge reads orders, returns, finance statements and their transactions, unsettled orders and inventory levels through the Authorization, Order, Return and Refund, Finance and Product APIs. It makes no call that changes the seller’s shop.</w:t>
       </w:r>
     </w:p>
     <w:p>
@@ -4710,10 +4730,20 @@
       <w:r>
         <w:rPr>
           <w:rFonts w:ascii="Calibri" w:cs="Calibri" w:eastAsia="Calibri" w:hAnsi="Calibri"/>
+          <w:b/>
           <w:sz w:val="21"/>
           <w:szCs w:val="21"/>
         </w:rPr>
-        <w:t>Scheduled sync. A sync runs every day at 05:47 UTC. Every write is idempotent, so reading the same data twice changes nothing.</w:t>
+        <w:t>Scheduled sync.</w:t>
+      </w:r>
+      <w:r>
+        <w:rPr>
+          <w:rFonts w:ascii="Calibri" w:cs="Calibri" w:eastAsia="Calibri" w:hAnsi="Calibri"/>
+          <w:b w:val="0"/>
+          <w:sz w:val="21"/>
+          <w:szCs w:val="21"/>
+        </w:rPr>
+        <w:t xml:space="preserve"> A sync runs every day at 05:47 UTC. Every write is idempotent, so reading the same data twice changes nothing.</w:t>
       </w:r>
     </w:p>
     <w:p>
@@ -4728,10 +4758,20 @@
       <w:r>
         <w:rPr>
           <w:rFonts w:ascii="Calibri" w:cs="Calibri" w:eastAsia="Calibri" w:hAnsi="Calibri"/>
+          <w:b/>
           <w:sz w:val="21"/>
           <w:szCs w:val="21"/>
         </w:rPr>
-        <w:t>Webhook endpoint. TikTok Shop sends events to https://my-shopedge-1.onrender.com/v1/webhooks/tiktok.</w:t>
+        <w:t>Webhook endpoint.</w:t>
+      </w:r>
+      <w:r>
+        <w:rPr>
+          <w:rFonts w:ascii="Calibri" w:cs="Calibri" w:eastAsia="Calibri" w:hAnsi="Calibri"/>
+          <w:b w:val="0"/>
+          <w:sz w:val="21"/>
+          <w:szCs w:val="21"/>
+        </w:rPr>
+        <w:t xml:space="preserve"> TikTok Shop sends events to https://my-shopedge-1.onrender.com/v1/webhooks/tiktok.</w:t>
       </w:r>
     </w:p>
     <w:p>
@@ -4746,10 +4786,20 @@
       <w:r>
         <w:rPr>
           <w:rFonts w:ascii="Calibri" w:cs="Calibri" w:eastAsia="Calibri" w:hAnsi="Calibri"/>
+          <w:b/>
           <w:sz w:val="21"/>
           <w:szCs w:val="21"/>
         </w:rPr>
-        <w:t>Signature check. The receiver computes HMAC-SHA256 over the app key followed by the raw request body, keyed with the app secret, and compares the lowercase hexadecimal result with the Authorization header. A request whose signature does not match is answered with 401 and is not processed.</w:t>
+        <w:t>Signature check.</w:t>
+      </w:r>
+      <w:r>
+        <w:rPr>
+          <w:rFonts w:ascii="Calibri" w:cs="Calibri" w:eastAsia="Calibri" w:hAnsi="Calibri"/>
+          <w:b w:val="0"/>
+          <w:sz w:val="21"/>
+          <w:szCs w:val="21"/>
+        </w:rPr>
+        <w:t xml:space="preserve"> The receiver computes HMAC-SHA256 over the app key followed by the raw request body, keyed with the app secret, and compares the lowercase hexadecimal result with the Authorization header. A request whose signature does not match is answered with 401 and is not processed.</w:t>
       </w:r>
     </w:p>
     <w:p>
@@ -4764,10 +4814,20 @@
       <w:r>
         <w:rPr>
           <w:rFonts w:ascii="Calibri" w:cs="Calibri" w:eastAsia="Calibri" w:hAnsi="Calibri"/>
+          <w:b/>
           <w:sz w:val="21"/>
           <w:szCs w:val="21"/>
         </w:rPr>
-        <w:t>Acknowledgement. A verified event is answered at once with HTTP 200 and an empty body, and the work is done afterwards in a background task, so the reply stays within TikTok’s three seconds.</w:t>
+        <w:t>Acknowledgement.</w:t>
+      </w:r>
+      <w:r>
+        <w:rPr>
+          <w:rFonts w:ascii="Calibri" w:cs="Calibri" w:eastAsia="Calibri" w:hAnsi="Calibri"/>
+          <w:b w:val="0"/>
+          <w:sz w:val="21"/>
+          <w:szCs w:val="21"/>
+        </w:rPr>
+        <w:t xml:space="preserve"> A verified event is answered at once with HTTP 200 and an empty body, and the work is done afterwards in a background task, so the reply stays within TikTok’s three seconds.</w:t>
       </w:r>
     </w:p>
     <w:p>
@@ -4782,10 +4842,20 @@
       <w:r>
         <w:rPr>
           <w:rFonts w:ascii="Calibri" w:cs="Calibri" w:eastAsia="Calibri" w:hAnsi="Calibri"/>
+          <w:b/>
           <w:sz w:val="21"/>
           <w:szCs w:val="21"/>
         </w:rPr>
-        <w:t>Repeated deliveries. Each event is recorded under its tts_notification_id, or under a hash of the body when that is absent. A repeated delivery is acknowledged but not processed again.</w:t>
+        <w:t>Repeated deliveries.</w:t>
+      </w:r>
+      <w:r>
+        <w:rPr>
+          <w:rFonts w:ascii="Calibri" w:cs="Calibri" w:eastAsia="Calibri" w:hAnsi="Calibri"/>
+          <w:b w:val="0"/>
+          <w:sz w:val="21"/>
+          <w:szCs w:val="21"/>
+        </w:rPr>
+        <w:t xml:space="preserve"> Each event is recorded under its tts_notification_id, or under a hash of the body when that is absent. A repeated delivery is acknowledged but not processed again.</w:t>
       </w:r>
     </w:p>
     <w:p>
@@ -4800,10 +4870,20 @@
       <w:r>
         <w:rPr>
           <w:rFonts w:ascii="Calibri" w:cs="Calibri" w:eastAsia="Calibri" w:hAnsi="Calibri"/>
+          <w:b/>
           <w:sz w:val="21"/>
           <w:szCs w:val="21"/>
         </w:rPr>
-        <w:t>Order, package, fulfilment, return, refund, product and inventory events. Each one starts a sync of that shop covering the last seven days, so the seller’s figures update without waiting for the daily sync.</w:t>
+        <w:t>Order, package, fulfilment, return, refund, product and inventory events.</w:t>
+      </w:r>
+      <w:r>
+        <w:rPr>
+          <w:rFonts w:ascii="Calibri" w:cs="Calibri" w:eastAsia="Calibri" w:hAnsi="Calibri"/>
+          <w:b w:val="0"/>
+          <w:sz w:val="21"/>
+          <w:szCs w:val="21"/>
+        </w:rPr>
+        <w:t xml:space="preserve"> Each one starts a sync of that shop covering the last seven days, so the seller’s figures update without waiting for the daily sync.</w:t>
       </w:r>
     </w:p>
     <w:p>
@@ -4818,10 +4898,20 @@
       <w:r>
         <w:rPr>
           <w:rFonts w:ascii="Calibri" w:cs="Calibri" w:eastAsia="Calibri" w:hAnsi="Calibri"/>
+          <w:b/>
           <w:sz w:val="21"/>
           <w:szCs w:val="21"/>
         </w:rPr>
-        <w:t>Seller deauthorisation. The shop is disconnected and its stored tokens are revoked.</w:t>
+        <w:t>Seller deauthorisation.</w:t>
+      </w:r>
+      <w:r>
+        <w:rPr>
+          <w:rFonts w:ascii="Calibri" w:cs="Calibri" w:eastAsia="Calibri" w:hAnsi="Calibri"/>
+          <w:b w:val="0"/>
+          <w:sz w:val="21"/>
+          <w:szCs w:val="21"/>
+        </w:rPr>
+        <w:t xml:space="preserve"> The shop is disconnected and its stored tokens are revoked.</w:t>
       </w:r>
     </w:p>
     <w:p>
@@ -4836,10 +4926,20 @@
       <w:r>
         <w:rPr>
           <w:rFonts w:ascii="Calibri" w:cs="Calibri" w:eastAsia="Calibri" w:hAnsi="Calibri"/>
+          <w:b/>
           <w:sz w:val="21"/>
           <w:szCs w:val="21"/>
         </w:rPr>
-        <w:t>Authorisation about to expire. The shop is marked as needing reconnection, and the seller sees a notice asking them to reconnect.</w:t>
+        <w:t>Authorisation about to expire.</w:t>
+      </w:r>
+      <w:r>
+        <w:rPr>
+          <w:rFonts w:ascii="Calibri" w:cs="Calibri" w:eastAsia="Calibri" w:hAnsi="Calibri"/>
+          <w:b w:val="0"/>
+          <w:sz w:val="21"/>
+          <w:szCs w:val="21"/>
+        </w:rPr>
+        <w:t xml:space="preserve"> The shop is marked as needing reconnection, and the seller sees a notice asking them to reconnect.</w:t>
       </w:r>
     </w:p>
     <w:p>
@@ -4854,10 +4954,20 @@
       <w:r>
         <w:rPr>
           <w:rFonts w:ascii="Calibri" w:cs="Calibri" w:eastAsia="Calibri" w:hAnsi="Calibri"/>
+          <w:b/>
           <w:sz w:val="21"/>
           <w:szCs w:val="21"/>
         </w:rPr>
-        <w:t>Unknown shops. An event for a shop that MyShopEdge does not hold is acknowledged and ignored.</w:t>
+        <w:t>Unknown shops.</w:t>
+      </w:r>
+      <w:r>
+        <w:rPr>
+          <w:rFonts w:ascii="Calibri" w:cs="Calibri" w:eastAsia="Calibri" w:hAnsi="Calibri"/>
+          <w:b w:val="0"/>
+          <w:sz w:val="21"/>
+          <w:szCs w:val="21"/>
+        </w:rPr>
+        <w:t xml:space="preserve"> An event for a shop that MyShopEdge does not hold is acknowledged and ignored.</w:t>
       </w:r>
     </w:p>
     <w:p>
@@ -4872,10 +4982,20 @@
       <w:r>
         <w:rPr>
           <w:rFonts w:ascii="Calibri" w:cs="Calibri" w:eastAsia="Calibri" w:hAnsi="Calibri"/>
+          <w:b/>
           <w:sz w:val="21"/>
           <w:szCs w:val="21"/>
         </w:rPr>
-        <w:t>Verification. 27 automated checks of the receiver pass, covering signature acceptance and rejection, a repeated delivery processed once and an event for an unknown shop ignored. On 10 October 2026 the live endpoint answered an unsigned request with 401. No event from TikTok has reached the endpoint yet.</w:t>
+        <w:t>Verification.</w:t>
+      </w:r>
+      <w:r>
+        <w:rPr>
+          <w:rFonts w:ascii="Calibri" w:cs="Calibri" w:eastAsia="Calibri" w:hAnsi="Calibri"/>
+          <w:b w:val="0"/>
+          <w:sz w:val="21"/>
+          <w:szCs w:val="21"/>
+        </w:rPr>
+        <w:t xml:space="preserve"> 27 automated checks of the receiver pass, covering signature acceptance and rejection, a repeated delivery processed once and an event for an unknown shop ignored. On 10 October 2026 the live endpoint answered an unsigned request with 401. No event from TikTok has reached the endpoint yet.</w:t>
       </w:r>
     </w:p>
     <w:p>
@@ -9981,7 +10101,7 @@
         <w:sz w:val="16"/>
         <w:szCs w:val="16"/>
       </w:rPr>
-      <w:t xml:space="preserve">Draft for review  |  Page </w:t>
+      <w:t xml:space="preserve">MSE-PRD-001 v0.3  |  Page </w:t>
     </w:r>
     <w:r>
       <w:rPr>

</xml_diff>